<commit_message>
Added the code separator to the workload template P-series rows
</commit_message>
<xml_diff>
--- a/public/downloads/2610-NTW2029workload.docx
+++ b/public/downloads/2610-NTW2029workload.docx
@@ -373,7 +373,7 @@
               <w:pStyle w:val="Compact"/>
             </w:pPr>
             <w:r>
-              <w:t>P01 Paper 1 pre-writing (optional)</w:t>
+              <w:t>P01 - Paper 1 pre-writing (optional)</w:t>
             </w:r>
           </w:p>
         </w:tc>
@@ -448,7 +448,7 @@
               <w:pStyle w:val="Compact"/>
             </w:pPr>
             <w:r>
-              <w:t>P02 Paper 1 Draft</w:t>
+              <w:t>P02 - Paper 1 Draft</w:t>
             </w:r>
           </w:p>
         </w:tc>
@@ -523,7 +523,7 @@
               <w:pStyle w:val="Compact"/>
             </w:pPr>
             <w:r>
-              <w:t>P03 Paper 1 Final</w:t>
+              <w:t>P03 - Paper 1 Final</w:t>
             </w:r>
           </w:p>
         </w:tc>
@@ -748,7 +748,7 @@
               <w:pStyle w:val="Compact"/>
             </w:pPr>
             <w:r>
-              <w:t>P04 Paper 2 Article Selection</w:t>
+              <w:t>P04 - Paper 2 Article Selection</w:t>
             </w:r>
           </w:p>
         </w:tc>
@@ -823,7 +823,10 @@
               <w:pStyle w:val="Compact"/>
             </w:pPr>
             <w:r>
-              <w:t>P05 Paper 2 Identify the Criticism and Verify Positions</w:t>
+              <w:t xml:space="preserve">P05 - Paper 2 </w:t>
+            </w:r>
+            <w:r>
+              <w:t>Verify Disagreement</w:t>
             </w:r>
           </w:p>
         </w:tc>
@@ -873,6 +876,7 @@
               <w:pStyle w:val="Compact"/>
             </w:pPr>
             <w:r>
+              <w:lastRenderedPageBreak/>
               <w:t>10.2 preparation</w:t>
             </w:r>
           </w:p>
@@ -898,7 +902,7 @@
               <w:pStyle w:val="Compact"/>
             </w:pPr>
             <w:r>
-              <w:t>P06 Paper 2 Going Beneath (working draft)</w:t>
+              <w:t>P06 - Paper 2 Going Beneath (working draft)</w:t>
             </w:r>
           </w:p>
         </w:tc>
@@ -973,7 +977,7 @@
               <w:pStyle w:val="Compact"/>
             </w:pPr>
             <w:r>
-              <w:t>P07 Paper 2 Full Draft and Outline</w:t>
+              <w:t>P07 - Paper 2 Full Draft and Outline</w:t>
             </w:r>
           </w:p>
         </w:tc>
@@ -1048,7 +1052,7 @@
               <w:pStyle w:val="Compact"/>
             </w:pPr>
             <w:r>
-              <w:t>P08 Paper 2 Final</w:t>
+              <w:t>P08 - Paper 2 Final</w:t>
             </w:r>
           </w:p>
         </w:tc>

</xml_diff>